<commit_message>
Swap Requests can now be exported
</commit_message>
<xml_diff>
--- a/resources/templates/ADR_template_2.docx
+++ b/resources/templates/ADR_template_2.docx
@@ -54,7 +54,6 @@
         <w:keepLines w:val="false"/>
         <w:pageBreakBefore w:val="false"/>
         <w:widowControl w:val="false"/>
-        <w:pBdr/>
         <w:shd w:val="clear" w:fill="auto"/>
         <w:spacing w:lineRule="auto" w:line="240" w:before="0" w:after="0"/>
         <w:ind w:hanging="0" w:start="0" w:end="0"/>
@@ -172,7 +171,6 @@
         <w:keepLines w:val="false"/>
         <w:pageBreakBefore w:val="false"/>
         <w:widowControl w:val="false"/>
-        <w:pBdr/>
         <w:shd w:val="clear" w:fill="auto"/>
         <w:spacing w:lineRule="auto" w:line="240" w:before="0" w:after="0"/>
         <w:ind w:hanging="0" w:start="2304" w:end="0"/>
@@ -272,7 +270,6 @@
         <w:keepLines w:val="false"/>
         <w:pageBreakBefore w:val="false"/>
         <w:widowControl w:val="false"/>
-        <w:pBdr/>
         <w:shd w:val="clear" w:fill="auto"/>
         <w:spacing w:lineRule="auto" w:line="240" w:before="1" w:after="0"/>
         <w:ind w:hanging="0" w:start="0" w:end="0"/>
@@ -477,7 +474,6 @@
         <w:keepLines w:val="false"/>
         <w:pageBreakBefore w:val="false"/>
         <w:widowControl w:val="false"/>
-        <w:pBdr/>
         <w:shd w:val="clear" w:fill="auto"/>
         <w:spacing w:lineRule="auto" w:line="240" w:before="17" w:after="0"/>
         <w:ind w:hanging="0" w:start="2304" w:end="0"/>
@@ -520,7 +516,7 @@
         <mc:AlternateContent>
           <mc:Choice Requires="wps">
             <w:drawing>
-              <wp:anchor behindDoc="0" distT="635" distB="0" distL="635" distR="0" simplePos="0" locked="0" layoutInCell="0" allowOverlap="1" relativeHeight="41">
+              <wp:anchor behindDoc="0" distT="635" distB="0" distL="635" distR="0" simplePos="0" locked="0" layoutInCell="0" allowOverlap="1" relativeHeight="47">
                 <wp:simplePos x="0" y="0"/>
                 <wp:positionH relativeFrom="column">
                   <wp:posOffset>67945</wp:posOffset>
@@ -545,9 +541,9 @@
                           <a:avLst/>
                           <a:gdLst>
                             <a:gd name="textAreaLeft" fmla="*/ 0 w 3292560"/>
-                            <a:gd name="textAreaRight" fmla="*/ 3292920 w 3292560"/>
+                            <a:gd name="textAreaRight" fmla="*/ 3293280 w 3292560"/>
                             <a:gd name="textAreaTop" fmla="*/ 0 h 15840"/>
-                            <a:gd name="textAreaBottom" fmla="*/ 16200 h 15840"/>
+                            <a:gd name="textAreaBottom" fmla="*/ 16560 h 15840"/>
                           </a:gdLst>
                           <a:ahLst/>
                           <a:cxnLst/>
@@ -606,7 +602,6 @@
         <w:keepLines w:val="false"/>
         <w:pageBreakBefore w:val="false"/>
         <w:widowControl w:val="false"/>
-        <w:pBdr/>
         <w:shd w:val="clear" w:fill="auto"/>
         <w:spacing w:lineRule="auto" w:line="240" w:before="0" w:after="0"/>
         <w:ind w:hanging="0" w:start="0" w:end="0"/>
@@ -656,7 +651,6 @@
         <w:keepLines w:val="false"/>
         <w:pageBreakBefore w:val="false"/>
         <w:widowControl w:val="false"/>
-        <w:pBdr/>
         <w:shd w:val="clear" w:fill="auto"/>
         <w:spacing w:lineRule="auto" w:line="240" w:before="50" w:after="0"/>
         <w:ind w:hanging="0" w:start="0" w:end="0"/>
@@ -710,7 +704,6 @@
           <w:ilvl w:val="0"/>
           <w:numId w:val="1"/>
         </w:numPr>
-        <w:pBdr/>
         <w:shd w:val="clear" w:fill="auto"/>
         <w:tabs>
           <w:tab w:val="clear" w:pos="720"/>
@@ -800,7 +793,6 @@
         <w:keepLines w:val="false"/>
         <w:pageBreakBefore w:val="false"/>
         <w:widowControl w:val="false"/>
-        <w:pBdr/>
         <w:shd w:val="clear" w:fill="auto"/>
         <w:spacing w:lineRule="auto" w:line="240" w:before="0" w:after="0"/>
         <w:ind w:hanging="0" w:start="0" w:end="0"/>
@@ -854,7 +846,6 @@
           <w:ilvl w:val="0"/>
           <w:numId w:val="1"/>
         </w:numPr>
-        <w:pBdr/>
         <w:shd w:val="clear" w:fill="auto"/>
         <w:tabs>
           <w:tab w:val="clear" w:pos="720"/>
@@ -908,7 +899,6 @@
         <w:keepLines w:val="false"/>
         <w:pageBreakBefore w:val="false"/>
         <w:widowControl w:val="false"/>
-        <w:pBdr/>
         <w:shd w:val="clear" w:fill="auto"/>
         <w:spacing w:lineRule="auto" w:line="240" w:before="49" w:after="1"/>
         <w:ind w:hanging="0" w:start="0" w:end="0"/>
@@ -967,8 +957,8 @@
         <w:tblLook w:val="0000"/>
       </w:tblPr>
       <w:tblGrid>
-        <w:gridCol w:w="344"/>
-        <w:gridCol w:w="2671"/>
+        <w:gridCol w:w="343"/>
+        <w:gridCol w:w="2672"/>
         <w:gridCol w:w="5625"/>
       </w:tblGrid>
       <w:tr>
@@ -992,7 +982,6 @@
               <w:keepNext w:val="false"/>
               <w:keepLines w:val="false"/>
               <w:widowControl w:val="false"/>
-              <w:pBdr/>
               <w:shd w:val="clear" w:fill="auto"/>
               <w:spacing w:lineRule="auto" w:line="187" w:before="1" w:after="0"/>
               <w:ind w:hanging="0" w:start="107" w:end="0"/>
@@ -1053,7 +1042,6 @@
               <w:keepNext w:val="false"/>
               <w:keepLines w:val="false"/>
               <w:widowControl w:val="false"/>
-              <w:pBdr/>
               <w:shd w:val="clear" w:fill="auto"/>
               <w:spacing w:lineRule="auto" w:line="187" w:before="1" w:after="0"/>
               <w:ind w:hanging="0" w:start="108" w:end="0"/>
@@ -1105,7 +1093,7 @@
         </w:trPr>
         <w:tc>
           <w:tcPr>
-            <w:tcW w:w="344" w:type="dxa"/>
+            <w:tcW w:w="343" w:type="dxa"/>
             <w:tcBorders>
               <w:top w:val="single" w:sz="4" w:space="0" w:color="000000"/>
               <w:start w:val="single" w:sz="4" w:space="0" w:color="000000"/>
@@ -1120,7 +1108,6 @@
               <w:keepNext w:val="false"/>
               <w:keepLines w:val="false"/>
               <w:widowControl w:val="false"/>
-              <w:pBdr/>
               <w:shd w:val="clear" w:fill="auto"/>
               <w:spacing w:lineRule="auto" w:line="240" w:before="0" w:after="0"/>
               <w:ind w:hanging="0" w:start="0" w:end="10"/>
@@ -1151,7 +1138,7 @@
         </w:tc>
         <w:tc>
           <w:tcPr>
-            <w:tcW w:w="2671" w:type="dxa"/>
+            <w:tcW w:w="2672" w:type="dxa"/>
             <w:tcBorders>
               <w:top w:val="single" w:sz="4" w:space="0" w:color="000000"/>
               <w:start w:val="single" w:sz="4" w:space="0" w:color="000000"/>
@@ -1183,7 +1170,6 @@
               <w:keepNext w:val="false"/>
               <w:keepLines w:val="false"/>
               <w:widowControl w:val="false"/>
-              <w:pBdr/>
               <w:shd w:val="clear" w:fill="auto"/>
               <w:spacing w:lineRule="auto" w:line="240" w:before="0" w:after="0"/>
               <w:ind w:hanging="0" w:start="0" w:end="0"/>
@@ -1239,7 +1225,6 @@
               <w:keepNext w:val="false"/>
               <w:keepLines w:val="false"/>
               <w:widowControl w:val="false"/>
-              <w:pBdr/>
               <w:shd w:val="clear" w:fill="auto"/>
               <w:tabs>
                 <w:tab w:val="clear" w:pos="720"/>
@@ -1270,7 +1255,6 @@
         <w:keepLines w:val="false"/>
         <w:pageBreakBefore w:val="false"/>
         <w:widowControl w:val="false"/>
-        <w:pBdr/>
         <w:shd w:val="clear" w:fill="auto"/>
         <w:spacing w:lineRule="auto" w:line="240" w:before="143" w:after="0"/>
         <w:ind w:hanging="0" w:start="0" w:end="0"/>
@@ -1324,7 +1308,6 @@
           <w:ilvl w:val="0"/>
           <w:numId w:val="1"/>
         </w:numPr>
-        <w:pBdr/>
         <w:shd w:val="clear" w:fill="auto"/>
         <w:tabs>
           <w:tab w:val="clear" w:pos="720"/>
@@ -1379,7 +1362,6 @@
         <w:keepLines w:val="false"/>
         <w:pageBreakBefore w:val="false"/>
         <w:widowControl w:val="false"/>
-        <w:pBdr/>
         <w:shd w:val="clear" w:fill="auto"/>
         <w:tabs>
           <w:tab w:val="clear" w:pos="720"/>
@@ -1468,7 +1450,6 @@
               <w:keepNext w:val="false"/>
               <w:keepLines w:val="false"/>
               <w:widowControl w:val="false"/>
-              <w:pBdr/>
               <w:shd w:val="clear" w:fill="auto"/>
               <w:spacing w:lineRule="auto" w:line="240" w:before="0" w:after="0"/>
               <w:ind w:hanging="0" w:start="7" w:end="0"/>
@@ -1529,7 +1510,6 @@
               <w:keepNext w:val="false"/>
               <w:keepLines w:val="false"/>
               <w:widowControl w:val="false"/>
-              <w:pBdr/>
               <w:shd w:val="clear" w:fill="auto"/>
               <w:spacing w:lineRule="auto" w:line="206" w:before="0" w:after="0"/>
               <w:ind w:hanging="0" w:start="583" w:end="0"/>
@@ -1596,7 +1576,6 @@
               <w:keepNext w:val="false"/>
               <w:keepLines w:val="false"/>
               <w:widowControl w:val="false"/>
-              <w:pBdr/>
               <w:shd w:val="clear" w:fill="auto"/>
               <w:spacing w:lineRule="auto" w:line="240" w:before="1" w:after="0"/>
               <w:ind w:hanging="0" w:start="107" w:end="0"/>
@@ -1660,7 +1639,6 @@
               <w:keepNext w:val="false"/>
               <w:keepLines w:val="false"/>
               <w:widowControl/>
-              <w:pBdr/>
               <w:shd w:val="clear" w:fill="auto"/>
               <w:spacing w:lineRule="auto" w:line="240" w:before="0" w:after="0"/>
               <w:ind w:hanging="0" w:start="0" w:end="0"/>
@@ -1683,7 +1661,6 @@
               <w:keepNext w:val="false"/>
               <w:keepLines w:val="false"/>
               <w:widowControl/>
-              <w:pBdr/>
               <w:shd w:val="clear" w:fill="auto"/>
               <w:spacing w:lineRule="auto" w:line="240" w:before="0" w:after="0"/>
               <w:ind w:hanging="0" w:start="0" w:end="0"/>
@@ -1755,7 +1732,6 @@
               <w:keepNext w:val="false"/>
               <w:keepLines w:val="false"/>
               <w:widowControl w:val="false"/>
-              <w:pBdr/>
               <w:shd w:val="clear" w:fill="auto"/>
               <w:spacing w:lineRule="auto" w:line="240" w:before="2" w:after="0"/>
               <w:ind w:hanging="0" w:start="105" w:end="98"/>
@@ -1782,7 +1758,6 @@
         <w:keepLines w:val="false"/>
         <w:pageBreakBefore w:val="false"/>
         <w:widowControl w:val="false"/>
-        <w:pBdr/>
         <w:shd w:val="clear" w:fill="auto"/>
         <w:spacing w:lineRule="auto" w:line="240" w:before="50" w:after="0"/>
         <w:ind w:hanging="0" w:start="0" w:end="0"/>
@@ -1806,7 +1781,6 @@
         <w:keepLines w:val="false"/>
         <w:pageBreakBefore w:val="false"/>
         <w:widowControl w:val="false"/>
-        <w:pBdr/>
         <w:shd w:val="clear" w:fill="auto"/>
         <w:spacing w:lineRule="auto" w:line="240" w:before="0" w:after="280"/>
         <w:ind w:hanging="358" w:start="0" w:end="0"/>
@@ -1870,7 +1844,6 @@
           <w:ilvl w:val="0"/>
           <w:numId w:val="2"/>
         </w:numPr>
-        <w:pBdr/>
         <w:shd w:val="clear" w:fill="auto"/>
         <w:spacing w:lineRule="auto" w:line="240" w:before="280" w:after="280"/>
         <w:ind w:hanging="360" w:start="630" w:end="0"/>
@@ -1955,7 +1928,6 @@
               <w:keepNext w:val="false"/>
               <w:keepLines w:val="false"/>
               <w:widowControl w:val="false"/>
-              <w:pBdr/>
               <w:shd w:val="clear" w:fill="auto"/>
               <w:spacing w:lineRule="auto" w:line="240" w:before="0" w:after="0"/>
               <w:ind w:hanging="358" w:start="430" w:end="0"/>
@@ -2017,7 +1989,6 @@
               <w:keepNext w:val="false"/>
               <w:keepLines w:val="false"/>
               <w:widowControl w:val="false"/>
-              <w:pBdr/>
               <w:shd w:val="clear" w:fill="auto"/>
               <w:spacing w:lineRule="auto" w:line="240" w:before="0" w:after="0"/>
               <w:ind w:hanging="244" w:start="244" w:end="0"/>
@@ -2079,7 +2050,6 @@
               <w:keepNext w:val="false"/>
               <w:keepLines w:val="false"/>
               <w:widowControl w:val="false"/>
-              <w:pBdr/>
               <w:shd w:val="clear" w:fill="auto"/>
               <w:spacing w:lineRule="auto" w:line="240" w:before="0" w:after="0"/>
               <w:ind w:hanging="358" w:start="426" w:end="0"/>
@@ -2141,7 +2111,6 @@
               <w:keepNext w:val="false"/>
               <w:keepLines w:val="false"/>
               <w:widowControl w:val="false"/>
-              <w:pBdr/>
               <w:shd w:val="clear" w:fill="auto"/>
               <w:spacing w:lineRule="auto" w:line="240" w:before="0" w:after="0"/>
               <w:ind w:hanging="358" w:start="359" w:end="0"/>
@@ -2407,7 +2376,6 @@
           <w:ilvl w:val="0"/>
           <w:numId w:val="2"/>
         </w:numPr>
-        <w:pBdr/>
         <w:shd w:val="clear" w:fill="auto"/>
         <w:spacing w:lineRule="auto" w:line="276" w:before="0" w:after="200"/>
         <w:ind w:hanging="360" w:start="630" w:end="0"/>
@@ -2467,8 +2435,8 @@
       </w:tblPr>
       <w:tblGrid>
         <w:gridCol w:w="3556"/>
-        <w:gridCol w:w="1365"/>
-        <w:gridCol w:w="3827"/>
+        <w:gridCol w:w="1364"/>
+        <w:gridCol w:w="3828"/>
       </w:tblGrid>
       <w:tr>
         <w:trPr>
@@ -2491,7 +2459,6 @@
               <w:keepNext w:val="false"/>
               <w:keepLines w:val="false"/>
               <w:widowControl w:val="false"/>
-              <w:pBdr/>
               <w:shd w:val="clear" w:fill="auto"/>
               <w:spacing w:lineRule="auto" w:line="240" w:before="0" w:after="0"/>
               <w:ind w:firstLine="70" w:start="0" w:end="0"/>
@@ -2538,7 +2505,7 @@
         </w:tc>
         <w:tc>
           <w:tcPr>
-            <w:tcW w:w="1365" w:type="dxa"/>
+            <w:tcW w:w="1364" w:type="dxa"/>
             <w:tcBorders>
               <w:top w:val="single" w:sz="4" w:space="0" w:color="000000"/>
               <w:start w:val="single" w:sz="4" w:space="0" w:color="000000"/>
@@ -2553,7 +2520,6 @@
               <w:keepNext w:val="false"/>
               <w:keepLines w:val="false"/>
               <w:widowControl w:val="false"/>
-              <w:pBdr/>
               <w:shd w:val="clear" w:fill="auto"/>
               <w:spacing w:lineRule="auto" w:line="240" w:before="0" w:after="0"/>
               <w:ind w:firstLine="11" w:start="0" w:end="0"/>
@@ -2600,7 +2566,7 @@
         </w:tc>
         <w:tc>
           <w:tcPr>
-            <w:tcW w:w="3827" w:type="dxa"/>
+            <w:tcW w:w="3828" w:type="dxa"/>
             <w:tcBorders>
               <w:top w:val="single" w:sz="4" w:space="0" w:color="000000"/>
               <w:start w:val="single" w:sz="4" w:space="0" w:color="000000"/>
@@ -2615,7 +2581,6 @@
               <w:keepNext w:val="false"/>
               <w:keepLines w:val="false"/>
               <w:widowControl w:val="false"/>
-              <w:pBdr/>
               <w:shd w:val="clear" w:fill="auto"/>
               <w:spacing w:lineRule="auto" w:line="240" w:before="0" w:after="0"/>
               <w:ind w:hanging="0" w:start="0" w:end="0"/>
@@ -2697,7 +2662,7 @@
         </w:tc>
         <w:tc>
           <w:tcPr>
-            <w:tcW w:w="1365" w:type="dxa"/>
+            <w:tcW w:w="1364" w:type="dxa"/>
             <w:tcBorders>
               <w:top w:val="single" w:sz="4" w:space="0" w:color="000000"/>
               <w:start w:val="single" w:sz="4" w:space="0" w:color="000000"/>
@@ -2727,7 +2692,7 @@
         </w:tc>
         <w:tc>
           <w:tcPr>
-            <w:tcW w:w="3827" w:type="dxa"/>
+            <w:tcW w:w="3828" w:type="dxa"/>
             <w:tcBorders>
               <w:top w:val="single" w:sz="4" w:space="0" w:color="000000"/>
               <w:start w:val="single" w:sz="4" w:space="0" w:color="000000"/>
@@ -2764,7 +2729,6 @@
         <w:keepLines w:val="false"/>
         <w:pageBreakBefore w:val="false"/>
         <w:widowControl w:val="false"/>
-        <w:pBdr/>
         <w:shd w:val="clear" w:fill="auto"/>
         <w:spacing w:lineRule="auto" w:line="240" w:before="0" w:after="0"/>
         <w:ind w:hanging="358" w:start="630" w:end="0"/>
@@ -2792,7 +2756,6 @@
         <w:keepLines w:val="false"/>
         <w:pageBreakBefore w:val="false"/>
         <w:widowControl w:val="false"/>
-        <w:pBdr/>
         <w:shd w:val="clear" w:fill="auto"/>
         <w:spacing w:lineRule="auto" w:line="240" w:before="0" w:after="0"/>
         <w:ind w:hanging="358" w:start="630" w:end="0"/>
@@ -2820,7 +2783,6 @@
         <w:keepLines w:val="false"/>
         <w:pageBreakBefore w:val="false"/>
         <w:widowControl w:val="false"/>
-        <w:pBdr/>
         <w:shd w:val="clear" w:fill="auto"/>
         <w:spacing w:lineRule="auto" w:line="240" w:before="0" w:after="0"/>
         <w:ind w:hanging="358" w:start="630" w:end="0"/>
@@ -2871,7 +2833,6 @@
         <w:keepLines w:val="false"/>
         <w:pageBreakBefore w:val="false"/>
         <w:widowControl w:val="false"/>
-        <w:pBdr/>
         <w:shd w:val="clear" w:fill="auto"/>
         <w:spacing w:lineRule="auto" w:line="240" w:before="0" w:after="0"/>
         <w:ind w:hanging="358" w:start="990" w:end="0"/>
@@ -2911,7 +2872,6 @@
         <w:keepLines w:val="false"/>
         <w:pageBreakBefore w:val="false"/>
         <w:widowControl w:val="false"/>
-        <w:pBdr/>
         <w:shd w:val="clear" w:fill="auto"/>
         <w:spacing w:lineRule="auto" w:line="240" w:before="0" w:after="0"/>
         <w:ind w:hanging="358" w:start="990" w:end="0"/>
@@ -2939,7 +2899,6 @@
         <w:keepLines w:val="false"/>
         <w:pageBreakBefore w:val="false"/>
         <w:widowControl w:val="false"/>
-        <w:pBdr/>
         <w:shd w:val="clear" w:fill="auto"/>
         <w:spacing w:lineRule="auto" w:line="240" w:before="0" w:after="0"/>
         <w:ind w:hanging="0" w:start="1440" w:end="0"/>
@@ -2968,7 +2927,6 @@
         <w:keepLines w:val="false"/>
         <w:pageBreakBefore w:val="false"/>
         <w:widowControl/>
-        <w:pBdr/>
         <w:shd w:val="clear" w:fill="auto"/>
         <w:spacing w:lineRule="auto" w:line="240" w:before="0" w:after="0"/>
         <w:ind w:hanging="0" w:start="1350" w:end="0"/>
@@ -3000,7 +2958,6 @@
           <w:ilvl w:val="0"/>
           <w:numId w:val="3"/>
         </w:numPr>
-        <w:pBdr/>
         <w:shd w:val="clear" w:fill="auto"/>
         <w:spacing w:lineRule="auto" w:line="240" w:before="0" w:after="0"/>
         <w:ind w:hanging="360" w:start="720" w:end="0"/>
@@ -3050,7 +3007,6 @@
         <w:keepLines w:val="false"/>
         <w:pageBreakBefore w:val="false"/>
         <w:widowControl/>
-        <w:pBdr/>
         <w:shd w:val="clear" w:fill="auto"/>
         <w:spacing w:lineRule="auto" w:line="240" w:before="0" w:after="0"/>
         <w:ind w:hanging="0" w:start="0" w:end="0"/>
@@ -3074,7 +3030,6 @@
         <w:keepLines w:val="false"/>
         <w:pageBreakBefore w:val="false"/>
         <w:widowControl/>
-        <w:pBdr/>
         <w:shd w:val="clear" w:fill="auto"/>
         <w:spacing w:lineRule="auto" w:line="240" w:before="0" w:after="0"/>
         <w:ind w:hanging="0" w:start="1440" w:end="0"/>
@@ -3107,7 +3062,6 @@
         <w:keepLines w:val="false"/>
         <w:pageBreakBefore w:val="false"/>
         <w:widowControl/>
-        <w:pBdr/>
         <w:shd w:val="clear" w:fill="auto"/>
         <w:tabs>
           <w:tab w:val="clear" w:pos="720"/>
@@ -3165,7 +3119,6 @@
           <w:ilvl w:val="0"/>
           <w:numId w:val="3"/>
         </w:numPr>
-        <w:pBdr/>
         <w:shd w:val="clear" w:fill="auto"/>
         <w:spacing w:lineRule="auto" w:line="240" w:before="0" w:after="0"/>
         <w:ind w:hanging="360" w:start="720" w:end="0"/>
@@ -3215,7 +3168,6 @@
         <w:keepLines w:val="false"/>
         <w:pageBreakBefore w:val="false"/>
         <w:widowControl/>
-        <w:pBdr/>
         <w:shd w:val="clear" w:fill="auto"/>
         <w:spacing w:lineRule="auto" w:line="240" w:before="0" w:after="280"/>
         <w:ind w:hanging="0" w:start="720" w:end="0"/>
@@ -3265,7 +3217,6 @@
         <w:keepLines w:val="false"/>
         <w:pageBreakBefore w:val="false"/>
         <w:widowControl w:val="false"/>
-        <w:pBdr/>
         <w:shd w:val="clear" w:fill="auto"/>
         <w:tabs>
           <w:tab w:val="clear" w:pos="720"/>
@@ -3347,7 +3298,6 @@
         <w:keepLines w:val="false"/>
         <w:pageBreakBefore w:val="false"/>
         <w:widowControl w:val="false"/>
-        <w:pBdr/>
         <w:shd w:val="clear" w:fill="auto"/>
         <w:spacing w:lineRule="auto" w:line="240" w:before="0" w:after="0"/>
         <w:ind w:hanging="0" w:start="0" w:end="0"/>
@@ -3464,6 +3414,8 @@
           <w:u w:val="none"/>
         </w:rPr>
         <w:t xml:space="preserve">                     </w:t>
+        <w:tab/>
+        <w:tab/>
       </w:r>
       <w:r>
         <w:rPr/>
@@ -3489,6 +3441,7 @@
           <w:u w:val="none"/>
         </w:rPr>
         <w:t xml:space="preserve">                                                             </w:t>
+        <w:tab/>
       </w:r>
       <w:r>
         <w:rPr>
@@ -3644,7 +3597,6 @@
     <w:p>
       <w:pPr>
         <w:pStyle w:val="Heading1"/>
-        <w:pBdr/>
         <w:shd w:val="clear" w:fill="auto"/>
         <w:spacing w:lineRule="auto" w:line="276" w:before="240" w:after="240"/>
         <w:ind w:start="0"/>
@@ -3867,7 +3819,7 @@
       <mc:AlternateContent>
         <mc:Choice Requires="wps">
           <w:drawing>
-            <wp:anchor behindDoc="1" distT="0" distB="0" distL="0" distR="0" simplePos="0" locked="0" layoutInCell="1" allowOverlap="1" relativeHeight="31">
+            <wp:anchor behindDoc="1" distT="12700" distB="13335" distL="12700" distR="13335" simplePos="0" locked="0" layoutInCell="1" allowOverlap="1" relativeHeight="35">
               <wp:simplePos x="0" y="0"/>
               <wp:positionH relativeFrom="column">
                 <wp:posOffset>-487680</wp:posOffset>
@@ -3892,9 +3844,9 @@
                         <a:avLst/>
                         <a:gdLst>
                           <a:gd name="textAreaLeft" fmla="*/ 0 w 3715200"/>
-                          <a:gd name="textAreaRight" fmla="*/ 3715560 w 3715200"/>
+                          <a:gd name="textAreaRight" fmla="*/ 3715920 w 3715200"/>
                           <a:gd name="textAreaTop" fmla="*/ 0 h 14400"/>
-                          <a:gd name="textAreaBottom" fmla="*/ 14760 h 14400"/>
+                          <a:gd name="textAreaBottom" fmla="*/ 15120 h 14400"/>
                         </a:gdLst>
                         <a:ahLst/>
                         <a:cxnLst/>
@@ -3938,7 +3890,7 @@
       <mc:AlternateContent>
         <mc:Choice Requires="wps">
           <w:drawing>
-            <wp:anchor behindDoc="1" distT="0" distB="0" distL="0" distR="0" simplePos="0" locked="0" layoutInCell="1" allowOverlap="1" relativeHeight="36">
+            <wp:anchor behindDoc="1" distT="0" distB="0" distL="0" distR="0" simplePos="0" locked="0" layoutInCell="1" allowOverlap="1" relativeHeight="41">
               <wp:simplePos x="0" y="0"/>
               <wp:positionH relativeFrom="column">
                 <wp:posOffset>1368425</wp:posOffset>
@@ -3977,7 +3929,7 @@
                       <w:txbxContent>
                         <w:p>
                           <w:pPr>
-                            <w:pStyle w:val="FrameContents"/>
+                            <w:pStyle w:val="FrameContentsuser"/>
                             <w:spacing w:lineRule="auto" w:line="252" w:before="20" w:after="0"/>
                             <w:ind w:firstLine="4" w:start="4" w:end="4"/>
                             <w:jc w:val="center"/>
@@ -4002,7 +3954,7 @@
                         </w:p>
                         <w:p>
                           <w:pPr>
-                            <w:pStyle w:val="FrameContents"/>
+                            <w:pStyle w:val="FrameContentsuser"/>
                             <w:spacing w:lineRule="auto" w:line="240" w:before="0" w:after="0"/>
                             <w:ind w:firstLine="636" w:start="639" w:end="634"/>
                             <w:jc w:val="center"/>
@@ -4076,7 +4028,7 @@
                         </w:p>
                         <w:p>
                           <w:pPr>
-                            <w:pStyle w:val="FrameContents"/>
+                            <w:pStyle w:val="FrameContentsuser"/>
                             <w:spacing w:lineRule="auto" w:line="240" w:before="0" w:after="0"/>
                             <w:ind w:firstLine="4" w:start="4" w:end="0"/>
                             <w:jc w:val="center"/>
@@ -4119,7 +4071,7 @@
                 <w:txbxContent>
                   <w:p>
                     <w:pPr>
-                      <w:pStyle w:val="FrameContents"/>
+                      <w:pStyle w:val="FrameContentsuser"/>
                       <w:spacing w:lineRule="auto" w:line="252" w:before="20" w:after="0"/>
                       <w:ind w:firstLine="4" w:start="4" w:end="4"/>
                       <w:jc w:val="center"/>
@@ -4144,7 +4096,7 @@
                   </w:p>
                   <w:p>
                     <w:pPr>
-                      <w:pStyle w:val="FrameContents"/>
+                      <w:pStyle w:val="FrameContentsuser"/>
                       <w:spacing w:lineRule="auto" w:line="240" w:before="0" w:after="0"/>
                       <w:ind w:firstLine="636" w:start="639" w:end="634"/>
                       <w:jc w:val="center"/>
@@ -4218,7 +4170,7 @@
                   </w:p>
                   <w:p>
                     <w:pPr>
-                      <w:pStyle w:val="FrameContents"/>
+                      <w:pStyle w:val="FrameContentsuser"/>
                       <w:spacing w:lineRule="auto" w:line="240" w:before="0" w:after="0"/>
                       <w:ind w:firstLine="4" w:start="4" w:end="0"/>
                       <w:jc w:val="center"/>
@@ -4257,7 +4209,6 @@
       <w:keepLines w:val="false"/>
       <w:pageBreakBefore w:val="false"/>
       <w:widowControl w:val="false"/>
-      <w:pBdr/>
       <w:shd w:val="clear" w:fill="auto"/>
       <w:spacing w:lineRule="auto" w:line="14" w:before="0" w:after="0"/>
       <w:ind w:hanging="0" w:start="0" w:end="0"/>
@@ -4281,7 +4232,6 @@
       <w:keepLines w:val="false"/>
       <w:pageBreakBefore w:val="false"/>
       <w:widowControl w:val="false"/>
-      <w:pBdr/>
       <w:shd w:val="clear" w:fill="auto"/>
       <w:spacing w:lineRule="auto" w:line="14" w:before="0" w:after="0"/>
       <w:ind w:hanging="0" w:start="0" w:end="0"/>
@@ -4297,7 +4247,7 @@
         <w:szCs w:val="20"/>
       </w:rPr>
       <w:drawing>
-        <wp:anchor behindDoc="1" distT="0" distB="0" distL="0" distR="0" simplePos="0" locked="0" layoutInCell="1" allowOverlap="1" relativeHeight="40">
+        <wp:anchor behindDoc="1" distT="0" distB="0" distL="0" distR="0" simplePos="0" locked="0" layoutInCell="1" allowOverlap="1" relativeHeight="46">
           <wp:simplePos x="0" y="0"/>
           <wp:positionH relativeFrom="column">
             <wp:posOffset>332105</wp:posOffset>
@@ -4347,7 +4297,6 @@
   <w:p>
     <w:pPr>
       <w:pStyle w:val="normal1"/>
-      <w:pBdr/>
       <w:shd w:val="clear" w:fill="auto"/>
       <w:jc w:val="center"/>
       <w:rPr>
@@ -4452,7 +4401,6 @@
       <w:keepLines w:val="false"/>
       <w:pageBreakBefore w:val="false"/>
       <w:widowControl w:val="false"/>
-      <w:pBdr/>
       <w:shd w:val="clear" w:fill="auto"/>
       <w:spacing w:lineRule="auto" w:line="14" w:before="0" w:after="0"/>
       <w:ind w:hanging="0" w:start="0" w:end="0"/>
@@ -4476,7 +4424,6 @@
       <w:keepLines w:val="false"/>
       <w:pageBreakBefore w:val="false"/>
       <w:widowControl w:val="false"/>
-      <w:pBdr/>
       <w:shd w:val="clear" w:fill="auto"/>
       <w:spacing w:lineRule="auto" w:line="14" w:before="0" w:after="0"/>
       <w:ind w:hanging="0" w:start="0" w:end="0"/>
@@ -4530,7 +4477,7 @@
       <mc:AlternateContent>
         <mc:Choice Requires="wps">
           <w:drawing>
-            <wp:anchor behindDoc="1" distT="0" distB="0" distL="0" distR="0" simplePos="0" locked="0" layoutInCell="1" allowOverlap="1" relativeHeight="31">
+            <wp:anchor behindDoc="1" distT="12700" distB="13335" distL="12700" distR="13335" simplePos="0" locked="0" layoutInCell="1" allowOverlap="1" relativeHeight="35">
               <wp:simplePos x="0" y="0"/>
               <wp:positionH relativeFrom="column">
                 <wp:posOffset>-487680</wp:posOffset>
@@ -4555,9 +4502,9 @@
                         <a:avLst/>
                         <a:gdLst>
                           <a:gd name="textAreaLeft" fmla="*/ 0 w 3715200"/>
-                          <a:gd name="textAreaRight" fmla="*/ 3715560 w 3715200"/>
+                          <a:gd name="textAreaRight" fmla="*/ 3715920 w 3715200"/>
                           <a:gd name="textAreaTop" fmla="*/ 0 h 14400"/>
-                          <a:gd name="textAreaBottom" fmla="*/ 14760 h 14400"/>
+                          <a:gd name="textAreaBottom" fmla="*/ 15120 h 14400"/>
                         </a:gdLst>
                         <a:ahLst/>
                         <a:cxnLst/>
@@ -4601,7 +4548,7 @@
       <mc:AlternateContent>
         <mc:Choice Requires="wps">
           <w:drawing>
-            <wp:anchor behindDoc="1" distT="0" distB="0" distL="0" distR="0" simplePos="0" locked="0" layoutInCell="1" allowOverlap="1" relativeHeight="36">
+            <wp:anchor behindDoc="1" distT="0" distB="0" distL="0" distR="0" simplePos="0" locked="0" layoutInCell="1" allowOverlap="1" relativeHeight="41">
               <wp:simplePos x="0" y="0"/>
               <wp:positionH relativeFrom="column">
                 <wp:posOffset>1368425</wp:posOffset>
@@ -4640,7 +4587,7 @@
                       <w:txbxContent>
                         <w:p>
                           <w:pPr>
-                            <w:pStyle w:val="FrameContents"/>
+                            <w:pStyle w:val="FrameContentsuser"/>
                             <w:spacing w:lineRule="auto" w:line="252" w:before="20" w:after="0"/>
                             <w:ind w:firstLine="4" w:start="4" w:end="4"/>
                             <w:jc w:val="center"/>
@@ -4665,7 +4612,7 @@
                         </w:p>
                         <w:p>
                           <w:pPr>
-                            <w:pStyle w:val="FrameContents"/>
+                            <w:pStyle w:val="FrameContentsuser"/>
                             <w:spacing w:lineRule="auto" w:line="240" w:before="0" w:after="0"/>
                             <w:ind w:firstLine="636" w:start="639" w:end="634"/>
                             <w:jc w:val="center"/>
@@ -4739,7 +4686,7 @@
                         </w:p>
                         <w:p>
                           <w:pPr>
-                            <w:pStyle w:val="FrameContents"/>
+                            <w:pStyle w:val="FrameContentsuser"/>
                             <w:spacing w:lineRule="auto" w:line="240" w:before="0" w:after="0"/>
                             <w:ind w:firstLine="4" w:start="4" w:end="0"/>
                             <w:jc w:val="center"/>
@@ -4782,7 +4729,7 @@
                 <w:txbxContent>
                   <w:p>
                     <w:pPr>
-                      <w:pStyle w:val="FrameContents"/>
+                      <w:pStyle w:val="FrameContentsuser"/>
                       <w:spacing w:lineRule="auto" w:line="252" w:before="20" w:after="0"/>
                       <w:ind w:firstLine="4" w:start="4" w:end="4"/>
                       <w:jc w:val="center"/>
@@ -4807,7 +4754,7 @@
                   </w:p>
                   <w:p>
                     <w:pPr>
-                      <w:pStyle w:val="FrameContents"/>
+                      <w:pStyle w:val="FrameContentsuser"/>
                       <w:spacing w:lineRule="auto" w:line="240" w:before="0" w:after="0"/>
                       <w:ind w:firstLine="636" w:start="639" w:end="634"/>
                       <w:jc w:val="center"/>
@@ -4881,7 +4828,7 @@
                   </w:p>
                   <w:p>
                     <w:pPr>
-                      <w:pStyle w:val="FrameContents"/>
+                      <w:pStyle w:val="FrameContentsuser"/>
                       <w:spacing w:lineRule="auto" w:line="240" w:before="0" w:after="0"/>
                       <w:ind w:firstLine="4" w:start="4" w:end="0"/>
                       <w:jc w:val="center"/>
@@ -4920,7 +4867,6 @@
       <w:keepLines w:val="false"/>
       <w:pageBreakBefore w:val="false"/>
       <w:widowControl w:val="false"/>
-      <w:pBdr/>
       <w:shd w:val="clear" w:fill="auto"/>
       <w:spacing w:lineRule="auto" w:line="14" w:before="0" w:after="0"/>
       <w:ind w:hanging="0" w:start="0" w:end="0"/>
@@ -4944,7 +4890,6 @@
       <w:keepLines w:val="false"/>
       <w:pageBreakBefore w:val="false"/>
       <w:widowControl w:val="false"/>
-      <w:pBdr/>
       <w:shd w:val="clear" w:fill="auto"/>
       <w:spacing w:lineRule="auto" w:line="14" w:before="0" w:after="0"/>
       <w:ind w:hanging="0" w:start="0" w:end="0"/>
@@ -4960,7 +4905,7 @@
         <w:szCs w:val="20"/>
       </w:rPr>
       <w:drawing>
-        <wp:anchor behindDoc="1" distT="0" distB="0" distL="0" distR="0" simplePos="0" locked="0" layoutInCell="1" allowOverlap="1" relativeHeight="40">
+        <wp:anchor behindDoc="1" distT="0" distB="0" distL="0" distR="0" simplePos="0" locked="0" layoutInCell="1" allowOverlap="1" relativeHeight="46">
           <wp:simplePos x="0" y="0"/>
           <wp:positionH relativeFrom="column">
             <wp:posOffset>332105</wp:posOffset>
@@ -5010,7 +4955,6 @@
   <w:p>
     <w:pPr>
       <w:pStyle w:val="normal1"/>
-      <w:pBdr/>
       <w:shd w:val="clear" w:fill="auto"/>
       <w:jc w:val="center"/>
       <w:rPr>
@@ -5115,7 +5059,6 @@
       <w:keepLines w:val="false"/>
       <w:pageBreakBefore w:val="false"/>
       <w:widowControl w:val="false"/>
-      <w:pBdr/>
       <w:shd w:val="clear" w:fill="auto"/>
       <w:spacing w:lineRule="auto" w:line="14" w:before="0" w:after="0"/>
       <w:ind w:hanging="0" w:start="0" w:end="0"/>
@@ -5139,7 +5082,6 @@
       <w:keepLines w:val="false"/>
       <w:pageBreakBefore w:val="false"/>
       <w:widowControl w:val="false"/>
-      <w:pBdr/>
       <w:shd w:val="clear" w:fill="auto"/>
       <w:spacing w:lineRule="auto" w:line="14" w:before="0" w:after="0"/>
       <w:ind w:hanging="0" w:start="0" w:end="0"/>
@@ -5197,7 +5139,6 @@
       <w:keepLines w:val="false"/>
       <w:pageBreakBefore w:val="false"/>
       <w:widowControl w:val="false"/>
-      <w:pBdr/>
       <w:shd w:val="clear" w:fill="auto"/>
       <w:spacing w:lineRule="auto" w:line="14" w:before="0" w:after="0"/>
       <w:ind w:hanging="0" w:start="0" w:end="0"/>
@@ -5282,7 +5223,7 @@
                       <w:txbxContent>
                         <w:p>
                           <w:pPr>
-                            <w:pStyle w:val="FrameContents"/>
+                            <w:pStyle w:val="FrameContentsuser"/>
                             <w:spacing w:lineRule="auto" w:line="192" w:before="21" w:after="0"/>
                             <w:ind w:firstLine="18" w:start="18" w:end="2"/>
                             <w:jc w:val="center"/>
@@ -5307,7 +5248,7 @@
                         </w:p>
                         <w:p>
                           <w:pPr>
-                            <w:pStyle w:val="FrameContents"/>
+                            <w:pStyle w:val="FrameContentsuser"/>
                             <w:spacing w:lineRule="auto" w:line="168" w:before="21" w:after="0"/>
                             <w:ind w:firstLine="18" w:start="18" w:end="0"/>
                             <w:jc w:val="center"/>
@@ -5332,19 +5273,23 @@
                         </w:p>
                         <w:p>
                           <w:pPr>
-                            <w:pStyle w:val="FrameContents"/>
+                            <w:pStyle w:val="FrameContentsuser"/>
                             <w:spacing w:lineRule="auto" w:line="168" w:before="21" w:after="0"/>
                             <w:ind w:firstLine="18" w:start="18" w:end="0"/>
                             <w:jc w:val="center"/>
-                            <w:rPr/>
+                            <w:rPr>
+                              <w:color w:val="000000"/>
+                            </w:rPr>
                           </w:pPr>
                           <w:r>
-                            <w:rPr/>
+                            <w:rPr>
+                              <w:color w:val="000000"/>
+                            </w:rPr>
                           </w:r>
                         </w:p>
                         <w:p>
                           <w:pPr>
-                            <w:pStyle w:val="FrameContents"/>
+                            <w:pStyle w:val="FrameContentsuser"/>
                             <w:spacing w:lineRule="auto" w:line="168" w:before="21" w:after="0"/>
                             <w:ind w:firstLine="18" w:start="18" w:end="0"/>
                             <w:jc w:val="center"/>
@@ -5387,7 +5332,7 @@
                 <w:txbxContent>
                   <w:p>
                     <w:pPr>
-                      <w:pStyle w:val="FrameContents"/>
+                      <w:pStyle w:val="FrameContentsuser"/>
                       <w:spacing w:lineRule="auto" w:line="192" w:before="21" w:after="0"/>
                       <w:ind w:firstLine="18" w:start="18" w:end="2"/>
                       <w:jc w:val="center"/>
@@ -5412,7 +5357,7 @@
                   </w:p>
                   <w:p>
                     <w:pPr>
-                      <w:pStyle w:val="FrameContents"/>
+                      <w:pStyle w:val="FrameContentsuser"/>
                       <w:spacing w:lineRule="auto" w:line="168" w:before="21" w:after="0"/>
                       <w:ind w:firstLine="18" w:start="18" w:end="0"/>
                       <w:jc w:val="center"/>
@@ -5437,19 +5382,23 @@
                   </w:p>
                   <w:p>
                     <w:pPr>
-                      <w:pStyle w:val="FrameContents"/>
+                      <w:pStyle w:val="FrameContentsuser"/>
                       <w:spacing w:lineRule="auto" w:line="168" w:before="21" w:after="0"/>
                       <w:ind w:firstLine="18" w:start="18" w:end="0"/>
                       <w:jc w:val="center"/>
-                      <w:rPr/>
+                      <w:rPr>
+                        <w:color w:val="000000"/>
+                      </w:rPr>
                     </w:pPr>
                     <w:r>
-                      <w:rPr/>
+                      <w:rPr>
+                        <w:color w:val="000000"/>
+                      </w:rPr>
                     </w:r>
                   </w:p>
                   <w:p>
                     <w:pPr>
-                      <w:pStyle w:val="FrameContents"/>
+                      <w:pStyle w:val="FrameContentsuser"/>
                       <w:spacing w:lineRule="auto" w:line="168" w:before="21" w:after="0"/>
                       <w:ind w:firstLine="18" w:start="18" w:end="0"/>
                       <w:jc w:val="center"/>
@@ -5482,7 +5431,7 @@
       <mc:AlternateContent>
         <mc:Choice Requires="wps">
           <w:drawing>
-            <wp:anchor behindDoc="1" distT="0" distB="0" distL="0" distR="0" simplePos="0" locked="0" layoutInCell="0" allowOverlap="1" relativeHeight="10">
+            <wp:anchor behindDoc="1" distT="12700" distB="12700" distL="12700" distR="13335" simplePos="0" locked="0" layoutInCell="0" allowOverlap="1" relativeHeight="11">
               <wp:simplePos x="0" y="0"/>
               <wp:positionH relativeFrom="page">
                 <wp:posOffset>1856740</wp:posOffset>
@@ -5507,9 +5456,9 @@
                         <a:avLst/>
                         <a:gdLst>
                           <a:gd name="textAreaLeft" fmla="*/ 0 w 2268000"/>
-                          <a:gd name="textAreaRight" fmla="*/ 2268360 w 2268000"/>
+                          <a:gd name="textAreaRight" fmla="*/ 2268720 w 2268000"/>
                           <a:gd name="textAreaTop" fmla="*/ 0 h 14400"/>
-                          <a:gd name="textAreaBottom" fmla="*/ 14760 h 14400"/>
+                          <a:gd name="textAreaBottom" fmla="*/ 15120 h 14400"/>
                         </a:gdLst>
                         <a:ahLst/>
                         <a:cxnLst/>
@@ -5551,7 +5500,7 @@
         </mc:Fallback>
       </mc:AlternateContent>
       <w:drawing>
-        <wp:anchor behindDoc="1" distT="0" distB="0" distL="0" distR="0" simplePos="0" locked="0" layoutInCell="0" allowOverlap="1" relativeHeight="13">
+        <wp:anchor behindDoc="1" distT="0" distB="0" distL="0" distR="0" simplePos="0" locked="0" layoutInCell="0" allowOverlap="1" relativeHeight="15">
           <wp:simplePos x="0" y="0"/>
           <wp:positionH relativeFrom="page">
             <wp:posOffset>5986145</wp:posOffset>
@@ -5597,7 +5546,7 @@
         </wp:anchor>
       </w:drawing>
       <w:drawing>
-        <wp:anchor behindDoc="1" distT="0" distB="0" distL="0" distR="0" simplePos="0" locked="0" layoutInCell="0" allowOverlap="1" relativeHeight="16">
+        <wp:anchor behindDoc="1" distT="0" distB="0" distL="0" distR="0" simplePos="0" locked="0" layoutInCell="0" allowOverlap="1" relativeHeight="18">
           <wp:simplePos x="0" y="0"/>
           <wp:positionH relativeFrom="page">
             <wp:posOffset>610870</wp:posOffset>
@@ -5645,7 +5594,7 @@
       <mc:AlternateContent>
         <mc:Choice Requires="wps">
           <w:drawing>
-            <wp:anchor behindDoc="1" distT="0" distB="0" distL="0" distR="0" simplePos="0" locked="0" layoutInCell="0" allowOverlap="1" relativeHeight="21">
+            <wp:anchor behindDoc="1" distT="0" distB="0" distL="0" distR="0" simplePos="0" locked="0" layoutInCell="0" allowOverlap="1" relativeHeight="23">
               <wp:simplePos x="0" y="0"/>
               <wp:positionH relativeFrom="page">
                 <wp:posOffset>3053715</wp:posOffset>
@@ -5684,7 +5633,7 @@
                       <w:txbxContent>
                         <w:p>
                           <w:pPr>
-                            <w:pStyle w:val="FrameContents"/>
+                            <w:pStyle w:val="FrameContentsuser"/>
                             <w:spacing w:lineRule="auto" w:line="240" w:before="15" w:after="0"/>
                             <w:ind w:firstLine="20" w:start="20" w:end="0"/>
                             <w:jc w:val="start"/>
@@ -5727,7 +5676,7 @@
                 <w:txbxContent>
                   <w:p>
                     <w:pPr>
-                      <w:pStyle w:val="FrameContents"/>
+                      <w:pStyle w:val="FrameContentsuser"/>
                       <w:spacing w:lineRule="auto" w:line="240" w:before="15" w:after="0"/>
                       <w:ind w:firstLine="20" w:start="20" w:end="0"/>
                       <w:jc w:val="start"/>
@@ -5760,7 +5709,7 @@
       <mc:AlternateContent>
         <mc:Choice Requires="wps">
           <w:drawing>
-            <wp:anchor behindDoc="1" distT="0" distB="0" distL="0" distR="0" simplePos="0" locked="0" layoutInCell="0" allowOverlap="1" relativeHeight="27">
+            <wp:anchor behindDoc="1" distT="0" distB="0" distL="0" distR="0" simplePos="0" locked="0" layoutInCell="0" allowOverlap="1" relativeHeight="30">
               <wp:simplePos x="0" y="0"/>
               <wp:positionH relativeFrom="page">
                 <wp:posOffset>2746375</wp:posOffset>
@@ -5799,7 +5748,7 @@
                       <w:txbxContent>
                         <w:p>
                           <w:pPr>
-                            <w:pStyle w:val="FrameContents"/>
+                            <w:pStyle w:val="FrameContentsuser"/>
                             <w:spacing w:lineRule="auto" w:line="240" w:before="14" w:after="0"/>
                             <w:ind w:firstLine="20" w:start="20" w:end="0"/>
                             <w:jc w:val="start"/>
@@ -5842,7 +5791,7 @@
                 <w:txbxContent>
                   <w:p>
                     <w:pPr>
-                      <w:pStyle w:val="FrameContents"/>
+                      <w:pStyle w:val="FrameContentsuser"/>
                       <w:spacing w:lineRule="auto" w:line="240" w:before="14" w:after="0"/>
                       <w:ind w:firstLine="20" w:start="20" w:end="0"/>
                       <w:jc w:val="start"/>
@@ -5886,7 +5835,6 @@
       <w:keepLines w:val="false"/>
       <w:pageBreakBefore w:val="false"/>
       <w:widowControl w:val="false"/>
-      <w:pBdr/>
       <w:shd w:val="clear" w:fill="auto"/>
       <w:spacing w:lineRule="auto" w:line="14" w:before="0" w:after="0"/>
       <w:ind w:hanging="0" w:start="0" w:end="0"/>
@@ -5971,7 +5919,7 @@
                       <w:txbxContent>
                         <w:p>
                           <w:pPr>
-                            <w:pStyle w:val="FrameContents"/>
+                            <w:pStyle w:val="FrameContentsuser"/>
                             <w:spacing w:lineRule="auto" w:line="192" w:before="21" w:after="0"/>
                             <w:ind w:firstLine="18" w:start="18" w:end="2"/>
                             <w:jc w:val="center"/>
@@ -5996,7 +5944,7 @@
                         </w:p>
                         <w:p>
                           <w:pPr>
-                            <w:pStyle w:val="FrameContents"/>
+                            <w:pStyle w:val="FrameContentsuser"/>
                             <w:spacing w:lineRule="auto" w:line="168" w:before="21" w:after="0"/>
                             <w:ind w:firstLine="18" w:start="18" w:end="0"/>
                             <w:jc w:val="center"/>
@@ -6021,19 +5969,23 @@
                         </w:p>
                         <w:p>
                           <w:pPr>
-                            <w:pStyle w:val="FrameContents"/>
+                            <w:pStyle w:val="FrameContentsuser"/>
                             <w:spacing w:lineRule="auto" w:line="168" w:before="21" w:after="0"/>
                             <w:ind w:firstLine="18" w:start="18" w:end="0"/>
                             <w:jc w:val="center"/>
-                            <w:rPr/>
+                            <w:rPr>
+                              <w:color w:val="000000"/>
+                            </w:rPr>
                           </w:pPr>
                           <w:r>
-                            <w:rPr/>
+                            <w:rPr>
+                              <w:color w:val="000000"/>
+                            </w:rPr>
                           </w:r>
                         </w:p>
                         <w:p>
                           <w:pPr>
-                            <w:pStyle w:val="FrameContents"/>
+                            <w:pStyle w:val="FrameContentsuser"/>
                             <w:spacing w:lineRule="auto" w:line="168" w:before="21" w:after="0"/>
                             <w:ind w:firstLine="18" w:start="18" w:end="0"/>
                             <w:jc w:val="center"/>
@@ -6076,7 +6028,7 @@
                 <w:txbxContent>
                   <w:p>
                     <w:pPr>
-                      <w:pStyle w:val="FrameContents"/>
+                      <w:pStyle w:val="FrameContentsuser"/>
                       <w:spacing w:lineRule="auto" w:line="192" w:before="21" w:after="0"/>
                       <w:ind w:firstLine="18" w:start="18" w:end="2"/>
                       <w:jc w:val="center"/>
@@ -6101,7 +6053,7 @@
                   </w:p>
                   <w:p>
                     <w:pPr>
-                      <w:pStyle w:val="FrameContents"/>
+                      <w:pStyle w:val="FrameContentsuser"/>
                       <w:spacing w:lineRule="auto" w:line="168" w:before="21" w:after="0"/>
                       <w:ind w:firstLine="18" w:start="18" w:end="0"/>
                       <w:jc w:val="center"/>
@@ -6126,19 +6078,23 @@
                   </w:p>
                   <w:p>
                     <w:pPr>
-                      <w:pStyle w:val="FrameContents"/>
+                      <w:pStyle w:val="FrameContentsuser"/>
                       <w:spacing w:lineRule="auto" w:line="168" w:before="21" w:after="0"/>
                       <w:ind w:firstLine="18" w:start="18" w:end="0"/>
                       <w:jc w:val="center"/>
-                      <w:rPr/>
+                      <w:rPr>
+                        <w:color w:val="000000"/>
+                      </w:rPr>
                     </w:pPr>
                     <w:r>
-                      <w:rPr/>
+                      <w:rPr>
+                        <w:color w:val="000000"/>
+                      </w:rPr>
                     </w:r>
                   </w:p>
                   <w:p>
                     <w:pPr>
-                      <w:pStyle w:val="FrameContents"/>
+                      <w:pStyle w:val="FrameContentsuser"/>
                       <w:spacing w:lineRule="auto" w:line="168" w:before="21" w:after="0"/>
                       <w:ind w:firstLine="18" w:start="18" w:end="0"/>
                       <w:jc w:val="center"/>
@@ -6171,7 +6127,7 @@
       <mc:AlternateContent>
         <mc:Choice Requires="wps">
           <w:drawing>
-            <wp:anchor behindDoc="1" distT="0" distB="0" distL="0" distR="0" simplePos="0" locked="0" layoutInCell="0" allowOverlap="1" relativeHeight="10">
+            <wp:anchor behindDoc="1" distT="12700" distB="12700" distL="12700" distR="13335" simplePos="0" locked="0" layoutInCell="0" allowOverlap="1" relativeHeight="11">
               <wp:simplePos x="0" y="0"/>
               <wp:positionH relativeFrom="page">
                 <wp:posOffset>1856740</wp:posOffset>
@@ -6196,9 +6152,9 @@
                         <a:avLst/>
                         <a:gdLst>
                           <a:gd name="textAreaLeft" fmla="*/ 0 w 2268000"/>
-                          <a:gd name="textAreaRight" fmla="*/ 2268360 w 2268000"/>
+                          <a:gd name="textAreaRight" fmla="*/ 2268720 w 2268000"/>
                           <a:gd name="textAreaTop" fmla="*/ 0 h 14400"/>
-                          <a:gd name="textAreaBottom" fmla="*/ 14760 h 14400"/>
+                          <a:gd name="textAreaBottom" fmla="*/ 15120 h 14400"/>
                         </a:gdLst>
                         <a:ahLst/>
                         <a:cxnLst/>
@@ -6240,7 +6196,7 @@
         </mc:Fallback>
       </mc:AlternateContent>
       <w:drawing>
-        <wp:anchor behindDoc="1" distT="0" distB="0" distL="0" distR="0" simplePos="0" locked="0" layoutInCell="0" allowOverlap="1" relativeHeight="13">
+        <wp:anchor behindDoc="1" distT="0" distB="0" distL="0" distR="0" simplePos="0" locked="0" layoutInCell="0" allowOverlap="1" relativeHeight="15">
           <wp:simplePos x="0" y="0"/>
           <wp:positionH relativeFrom="page">
             <wp:posOffset>5986145</wp:posOffset>
@@ -6286,7 +6242,7 @@
         </wp:anchor>
       </w:drawing>
       <w:drawing>
-        <wp:anchor behindDoc="1" distT="0" distB="0" distL="0" distR="0" simplePos="0" locked="0" layoutInCell="0" allowOverlap="1" relativeHeight="16">
+        <wp:anchor behindDoc="1" distT="0" distB="0" distL="0" distR="0" simplePos="0" locked="0" layoutInCell="0" allowOverlap="1" relativeHeight="18">
           <wp:simplePos x="0" y="0"/>
           <wp:positionH relativeFrom="page">
             <wp:posOffset>610870</wp:posOffset>
@@ -6334,7 +6290,7 @@
       <mc:AlternateContent>
         <mc:Choice Requires="wps">
           <w:drawing>
-            <wp:anchor behindDoc="1" distT="0" distB="0" distL="0" distR="0" simplePos="0" locked="0" layoutInCell="0" allowOverlap="1" relativeHeight="21">
+            <wp:anchor behindDoc="1" distT="0" distB="0" distL="0" distR="0" simplePos="0" locked="0" layoutInCell="0" allowOverlap="1" relativeHeight="23">
               <wp:simplePos x="0" y="0"/>
               <wp:positionH relativeFrom="page">
                 <wp:posOffset>3053715</wp:posOffset>
@@ -6373,7 +6329,7 @@
                       <w:txbxContent>
                         <w:p>
                           <w:pPr>
-                            <w:pStyle w:val="FrameContents"/>
+                            <w:pStyle w:val="FrameContentsuser"/>
                             <w:spacing w:lineRule="auto" w:line="240" w:before="15" w:after="0"/>
                             <w:ind w:firstLine="20" w:start="20" w:end="0"/>
                             <w:jc w:val="start"/>
@@ -6416,7 +6372,7 @@
                 <w:txbxContent>
                   <w:p>
                     <w:pPr>
-                      <w:pStyle w:val="FrameContents"/>
+                      <w:pStyle w:val="FrameContentsuser"/>
                       <w:spacing w:lineRule="auto" w:line="240" w:before="15" w:after="0"/>
                       <w:ind w:firstLine="20" w:start="20" w:end="0"/>
                       <w:jc w:val="start"/>
@@ -6449,7 +6405,7 @@
       <mc:AlternateContent>
         <mc:Choice Requires="wps">
           <w:drawing>
-            <wp:anchor behindDoc="1" distT="0" distB="0" distL="0" distR="0" simplePos="0" locked="0" layoutInCell="0" allowOverlap="1" relativeHeight="27">
+            <wp:anchor behindDoc="1" distT="0" distB="0" distL="0" distR="0" simplePos="0" locked="0" layoutInCell="0" allowOverlap="1" relativeHeight="30">
               <wp:simplePos x="0" y="0"/>
               <wp:positionH relativeFrom="page">
                 <wp:posOffset>2746375</wp:posOffset>
@@ -6488,7 +6444,7 @@
                       <w:txbxContent>
                         <w:p>
                           <w:pPr>
-                            <w:pStyle w:val="FrameContents"/>
+                            <w:pStyle w:val="FrameContentsuser"/>
                             <w:spacing w:lineRule="auto" w:line="240" w:before="14" w:after="0"/>
                             <w:ind w:firstLine="20" w:start="20" w:end="0"/>
                             <w:jc w:val="start"/>
@@ -6531,7 +6487,7 @@
                 <w:txbxContent>
                   <w:p>
                     <w:pPr>
-                      <w:pStyle w:val="FrameContents"/>
+                      <w:pStyle w:val="FrameContentsuser"/>
                       <w:spacing w:lineRule="auto" w:line="240" w:before="14" w:after="0"/>
                       <w:ind w:firstLine="20" w:start="20" w:end="0"/>
                       <w:jc w:val="start"/>
@@ -7103,6 +7059,7 @@
     <w:qFormat/>
     <w:pPr>
       <w:widowControl w:val="false"/>
+      <w:suppressAutoHyphens w:val="true"/>
       <w:bidi w:val="0"/>
       <w:spacing w:before="0" w:after="0"/>
       <w:jc w:val="start"/>
@@ -7287,6 +7244,7 @@
     <w:qFormat/>
     <w:pPr>
       <w:widowControl w:val="false"/>
+      <w:suppressAutoHyphens w:val="true"/>
       <w:bidi w:val="0"/>
       <w:spacing w:before="0" w:after="0"/>
       <w:jc w:val="start"/>
@@ -7349,8 +7307,8 @@
     <w:pPr/>
     <w:rPr/>
   </w:style>
-  <w:style w:type="paragraph" w:styleId="FrameContents">
-    <w:name w:val="Frame Contents"/>
+  <w:style w:type="paragraph" w:styleId="FrameContentsuser">
+    <w:name w:val="Frame Contents (user)"/>
     <w:basedOn w:val="Normal"/>
     <w:qFormat/>
     <w:pPr/>
@@ -7359,6 +7317,13 @@
   <w:style w:type="paragraph" w:styleId="Footer">
     <w:name w:val="footer"/>
     <w:basedOn w:val="HeaderandFooter"/>
+    <w:pPr/>
+    <w:rPr/>
+  </w:style>
+  <w:style w:type="paragraph" w:styleId="FrameContents">
+    <w:name w:val="Frame Contents"/>
+    <w:basedOn w:val="Normal"/>
+    <w:qFormat/>
     <w:pPr/>
     <w:rPr/>
   </w:style>

</xml_diff>